<commit_message>
Add project link (Vercel) to final report and README
Co-Authored-By: Claude Opus 5.5 <noreply@anthropic.com>
</commit_message>
<xml_diff>
--- a/report/Payroll_DBMS_Final_Report_Review3.docx
+++ b/report/Payroll_DBMS_Final_Report_Review3.docx
@@ -142,6 +142,22 @@
       </w:r>
     </w:p>
     <w:p>
+      <w:pPr>
+        <w:spacing w:before="200"/>
+        <w:jc w:val="center"/>
+      </w:pPr>
+      <w:r>
+        <w:rPr>
+          <w:b/>
+          <w:bCs/>
+        </w:rPr>
+        <w:t xml:space="preserve">Project link: </w:t>
+      </w:r>
+      <w:r>
+        <w:t>https://dbs-proj-mauve.vercel.app</w:t>
+      </w:r>
+    </w:p>
+    <w:p>
       <w:r>
         <w:br w:type="page"/>
       </w:r>
@@ -150,7 +166,7 @@
       <w:pPr>
         <w:pStyle w:val="Heading1"/>
       </w:pPr>
-      <w:bookmarkStart w:id="0" w:name="_Toc243400830"/>
+      <w:bookmarkStart w:id="0" w:name="_Toc243510113"/>
       <w:r>
         <w:t>Contents</w:t>
       </w:r>
@@ -159,7 +175,7 @@
     <w:sdt>
       <w:sdtPr>
         <w:alias w:val="Contents"/>
-        <w:id w:val="-39678193"/>
+        <w:id w:val="-1297371263"/>
       </w:sdtPr>
       <w:sdtEndPr/>
       <w:sdtContent>
@@ -187,7 +203,7 @@
           <w:r>
             <w:fldChar w:fldCharType="separate"/>
           </w:r>
-          <w:hyperlink w:anchor="_Toc243400830" w:history="1">
+          <w:hyperlink w:anchor="_Toc243510113" w:history="1">
             <w:r>
               <w:rPr>
                 <w:rStyle w:val="Hyperlink"/>
@@ -211,7 +227,7 @@
               <w:rPr>
                 <w:noProof/>
               </w:rPr>
-              <w:instrText xml:space="preserve"> PAGEREF _Toc243400830 \h </w:instrText>
+              <w:instrText xml:space="preserve"> PAGEREF _Toc243510113 \h </w:instrText>
             </w:r>
             <w:r>
               <w:rPr>
@@ -253,7 +269,7 @@
               <w14:ligatures w14:val="standardContextual"/>
             </w:rPr>
           </w:pPr>
-          <w:hyperlink w:anchor="_Toc243400831" w:history="1">
+          <w:hyperlink w:anchor="_Toc243510114" w:history="1">
             <w:r>
               <w:rPr>
                 <w:rStyle w:val="Hyperlink"/>
@@ -277,7 +293,7 @@
               <w:rPr>
                 <w:noProof/>
               </w:rPr>
-              <w:instrText xml:space="preserve"> PAGEREF _Toc243400831 \h </w:instrText>
+              <w:instrText xml:space="preserve"> PAGEREF _Toc243510114 \h </w:instrText>
             </w:r>
             <w:r>
               <w:rPr>
@@ -319,7 +335,7 @@
               <w14:ligatures w14:val="standardContextual"/>
             </w:rPr>
           </w:pPr>
-          <w:hyperlink w:anchor="_Toc243400832" w:history="1">
+          <w:hyperlink w:anchor="_Toc243510115" w:history="1">
             <w:r>
               <w:rPr>
                 <w:rStyle w:val="Hyperlink"/>
@@ -343,7 +359,7 @@
               <w:rPr>
                 <w:noProof/>
               </w:rPr>
-              <w:instrText xml:space="preserve"> PAGEREF _Toc243400832 \h </w:instrText>
+              <w:instrText xml:space="preserve"> PAGEREF _Toc243510115 \h </w:instrText>
             </w:r>
             <w:r>
               <w:rPr>
@@ -385,7 +401,7 @@
               <w14:ligatures w14:val="standardContextual"/>
             </w:rPr>
           </w:pPr>
-          <w:hyperlink w:anchor="_Toc243400833" w:history="1">
+          <w:hyperlink w:anchor="_Toc243510116" w:history="1">
             <w:r>
               <w:rPr>
                 <w:rStyle w:val="Hyperlink"/>
@@ -409,7 +425,7 @@
               <w:rPr>
                 <w:noProof/>
               </w:rPr>
-              <w:instrText xml:space="preserve"> PAGEREF _Toc243400833 \h </w:instrText>
+              <w:instrText xml:space="preserve"> PAGEREF _Toc243510116 \h </w:instrText>
             </w:r>
             <w:r>
               <w:rPr>
@@ -451,7 +467,7 @@
               <w14:ligatures w14:val="standardContextual"/>
             </w:rPr>
           </w:pPr>
-          <w:hyperlink w:anchor="_Toc243400834" w:history="1">
+          <w:hyperlink w:anchor="_Toc243510117" w:history="1">
             <w:r>
               <w:rPr>
                 <w:rStyle w:val="Hyperlink"/>
@@ -475,7 +491,7 @@
               <w:rPr>
                 <w:noProof/>
               </w:rPr>
-              <w:instrText xml:space="preserve"> PAGEREF _Toc243400834 \h </w:instrText>
+              <w:instrText xml:space="preserve"> PAGEREF _Toc243510117 \h </w:instrText>
             </w:r>
             <w:r>
               <w:rPr>
@@ -517,7 +533,7 @@
               <w14:ligatures w14:val="standardContextual"/>
             </w:rPr>
           </w:pPr>
-          <w:hyperlink w:anchor="_Toc243400835" w:history="1">
+          <w:hyperlink w:anchor="_Toc243510118" w:history="1">
             <w:r>
               <w:rPr>
                 <w:rStyle w:val="Hyperlink"/>
@@ -541,7 +557,7 @@
               <w:rPr>
                 <w:noProof/>
               </w:rPr>
-              <w:instrText xml:space="preserve"> PAGEREF _Toc243400835 \h </w:instrText>
+              <w:instrText xml:space="preserve"> PAGEREF _Toc243510118 \h </w:instrText>
             </w:r>
             <w:r>
               <w:rPr>
@@ -583,7 +599,7 @@
               <w14:ligatures w14:val="standardContextual"/>
             </w:rPr>
           </w:pPr>
-          <w:hyperlink w:anchor="_Toc243400836" w:history="1">
+          <w:hyperlink w:anchor="_Toc243510119" w:history="1">
             <w:r>
               <w:rPr>
                 <w:rStyle w:val="Hyperlink"/>
@@ -607,7 +623,7 @@
               <w:rPr>
                 <w:noProof/>
               </w:rPr>
-              <w:instrText xml:space="preserve"> PAGEREF _Toc243400836 \h </w:instrText>
+              <w:instrText xml:space="preserve"> PAGEREF _Toc243510119 \h </w:instrText>
             </w:r>
             <w:r>
               <w:rPr>
@@ -649,7 +665,7 @@
               <w14:ligatures w14:val="standardContextual"/>
             </w:rPr>
           </w:pPr>
-          <w:hyperlink w:anchor="_Toc243400837" w:history="1">
+          <w:hyperlink w:anchor="_Toc243510120" w:history="1">
             <w:r>
               <w:rPr>
                 <w:rStyle w:val="Hyperlink"/>
@@ -673,7 +689,7 @@
               <w:rPr>
                 <w:noProof/>
               </w:rPr>
-              <w:instrText xml:space="preserve"> PAGEREF _Toc243400837 \h </w:instrText>
+              <w:instrText xml:space="preserve"> PAGEREF _Toc243510120 \h </w:instrText>
             </w:r>
             <w:r>
               <w:rPr>
@@ -715,7 +731,7 @@
               <w14:ligatures w14:val="standardContextual"/>
             </w:rPr>
           </w:pPr>
-          <w:hyperlink w:anchor="_Toc243400838" w:history="1">
+          <w:hyperlink w:anchor="_Toc243510121" w:history="1">
             <w:r>
               <w:rPr>
                 <w:rStyle w:val="Hyperlink"/>
@@ -739,7 +755,7 @@
               <w:rPr>
                 <w:noProof/>
               </w:rPr>
-              <w:instrText xml:space="preserve"> PAGEREF _Toc243400838 \h </w:instrText>
+              <w:instrText xml:space="preserve"> PAGEREF _Toc243510121 \h </w:instrText>
             </w:r>
             <w:r>
               <w:rPr>
@@ -781,7 +797,7 @@
               <w14:ligatures w14:val="standardContextual"/>
             </w:rPr>
           </w:pPr>
-          <w:hyperlink w:anchor="_Toc243400839" w:history="1">
+          <w:hyperlink w:anchor="_Toc243510122" w:history="1">
             <w:r>
               <w:rPr>
                 <w:rStyle w:val="Hyperlink"/>
@@ -805,7 +821,7 @@
               <w:rPr>
                 <w:noProof/>
               </w:rPr>
-              <w:instrText xml:space="preserve"> PAGEREF _Toc243400839 \h </w:instrText>
+              <w:instrText xml:space="preserve"> PAGEREF _Toc243510122 \h </w:instrText>
             </w:r>
             <w:r>
               <w:rPr>
@@ -847,7 +863,7 @@
               <w14:ligatures w14:val="standardContextual"/>
             </w:rPr>
           </w:pPr>
-          <w:hyperlink w:anchor="_Toc243400840" w:history="1">
+          <w:hyperlink w:anchor="_Toc243510123" w:history="1">
             <w:r>
               <w:rPr>
                 <w:rStyle w:val="Hyperlink"/>
@@ -871,7 +887,7 @@
               <w:rPr>
                 <w:noProof/>
               </w:rPr>
-              <w:instrText xml:space="preserve"> PAGEREF _Toc243400840 \h </w:instrText>
+              <w:instrText xml:space="preserve"> PAGEREF _Toc243510123 \h </w:instrText>
             </w:r>
             <w:r>
               <w:rPr>
@@ -913,7 +929,7 @@
               <w14:ligatures w14:val="standardContextual"/>
             </w:rPr>
           </w:pPr>
-          <w:hyperlink w:anchor="_Toc243400841" w:history="1">
+          <w:hyperlink w:anchor="_Toc243510124" w:history="1">
             <w:r>
               <w:rPr>
                 <w:rStyle w:val="Hyperlink"/>
@@ -937,7 +953,7 @@
               <w:rPr>
                 <w:noProof/>
               </w:rPr>
-              <w:instrText xml:space="preserve"> PAGEREF _Toc243400841 \h </w:instrText>
+              <w:instrText xml:space="preserve"> PAGEREF _Toc243510124 \h </w:instrText>
             </w:r>
             <w:r>
               <w:rPr>
@@ -979,7 +995,7 @@
               <w14:ligatures w14:val="standardContextual"/>
             </w:rPr>
           </w:pPr>
-          <w:hyperlink w:anchor="_Toc243400842" w:history="1">
+          <w:hyperlink w:anchor="_Toc243510125" w:history="1">
             <w:r>
               <w:rPr>
                 <w:rStyle w:val="Hyperlink"/>
@@ -1003,7 +1019,7 @@
               <w:rPr>
                 <w:noProof/>
               </w:rPr>
-              <w:instrText xml:space="preserve"> PAGEREF _Toc243400842 \h </w:instrText>
+              <w:instrText xml:space="preserve"> PAGEREF _Toc243510125 \h </w:instrText>
             </w:r>
             <w:r>
               <w:rPr>
@@ -1045,7 +1061,7 @@
               <w14:ligatures w14:val="standardContextual"/>
             </w:rPr>
           </w:pPr>
-          <w:hyperlink w:anchor="_Toc243400843" w:history="1">
+          <w:hyperlink w:anchor="_Toc243510126" w:history="1">
             <w:r>
               <w:rPr>
                 <w:rStyle w:val="Hyperlink"/>
@@ -1069,7 +1085,7 @@
               <w:rPr>
                 <w:noProof/>
               </w:rPr>
-              <w:instrText xml:space="preserve"> PAGEREF _Toc243400843 \h </w:instrText>
+              <w:instrText xml:space="preserve"> PAGEREF _Toc243510126 \h </w:instrText>
             </w:r>
             <w:r>
               <w:rPr>
@@ -1111,7 +1127,7 @@
               <w14:ligatures w14:val="standardContextual"/>
             </w:rPr>
           </w:pPr>
-          <w:hyperlink w:anchor="_Toc243400844" w:history="1">
+          <w:hyperlink w:anchor="_Toc243510127" w:history="1">
             <w:r>
               <w:rPr>
                 <w:rStyle w:val="Hyperlink"/>
@@ -1135,7 +1151,7 @@
               <w:rPr>
                 <w:noProof/>
               </w:rPr>
-              <w:instrText xml:space="preserve"> PAGEREF _Toc243400844 \h </w:instrText>
+              <w:instrText xml:space="preserve"> PAGEREF _Toc243510127 \h </w:instrText>
             </w:r>
             <w:r>
               <w:rPr>
@@ -1177,7 +1193,7 @@
               <w14:ligatures w14:val="standardContextual"/>
             </w:rPr>
           </w:pPr>
-          <w:hyperlink w:anchor="_Toc243400845" w:history="1">
+          <w:hyperlink w:anchor="_Toc243510128" w:history="1">
             <w:r>
               <w:rPr>
                 <w:rStyle w:val="Hyperlink"/>
@@ -1201,7 +1217,7 @@
               <w:rPr>
                 <w:noProof/>
               </w:rPr>
-              <w:instrText xml:space="preserve"> PAGEREF _Toc243400845 \h </w:instrText>
+              <w:instrText xml:space="preserve"> PAGEREF _Toc243510128 \h </w:instrText>
             </w:r>
             <w:r>
               <w:rPr>
@@ -1243,7 +1259,7 @@
               <w14:ligatures w14:val="standardContextual"/>
             </w:rPr>
           </w:pPr>
-          <w:hyperlink w:anchor="_Toc243400846" w:history="1">
+          <w:hyperlink w:anchor="_Toc243510129" w:history="1">
             <w:r>
               <w:rPr>
                 <w:rStyle w:val="Hyperlink"/>
@@ -1267,7 +1283,7 @@
               <w:rPr>
                 <w:noProof/>
               </w:rPr>
-              <w:instrText xml:space="preserve"> PAGEREF _Toc243400846 \h </w:instrText>
+              <w:instrText xml:space="preserve"> PAGEREF _Toc243510129 \h </w:instrText>
             </w:r>
             <w:r>
               <w:rPr>
@@ -1309,7 +1325,7 @@
               <w14:ligatures w14:val="standardContextual"/>
             </w:rPr>
           </w:pPr>
-          <w:hyperlink w:anchor="_Toc243400847" w:history="1">
+          <w:hyperlink w:anchor="_Toc243510130" w:history="1">
             <w:r>
               <w:rPr>
                 <w:rStyle w:val="Hyperlink"/>
@@ -1333,7 +1349,7 @@
               <w:rPr>
                 <w:noProof/>
               </w:rPr>
-              <w:instrText xml:space="preserve"> PAGEREF _Toc243400847 \h </w:instrText>
+              <w:instrText xml:space="preserve"> PAGEREF _Toc243510130 \h </w:instrText>
             </w:r>
             <w:r>
               <w:rPr>
@@ -1375,7 +1391,7 @@
               <w14:ligatures w14:val="standardContextual"/>
             </w:rPr>
           </w:pPr>
-          <w:hyperlink w:anchor="_Toc243400848" w:history="1">
+          <w:hyperlink w:anchor="_Toc243510131" w:history="1">
             <w:r>
               <w:rPr>
                 <w:rStyle w:val="Hyperlink"/>
@@ -1399,7 +1415,7 @@
               <w:rPr>
                 <w:noProof/>
               </w:rPr>
-              <w:instrText xml:space="preserve"> PAGEREF _Toc243400848 \h </w:instrText>
+              <w:instrText xml:space="preserve"> PAGEREF _Toc243510131 \h </w:instrText>
             </w:r>
             <w:r>
               <w:rPr>
@@ -1441,7 +1457,7 @@
               <w14:ligatures w14:val="standardContextual"/>
             </w:rPr>
           </w:pPr>
-          <w:hyperlink w:anchor="_Toc243400849" w:history="1">
+          <w:hyperlink w:anchor="_Toc243510132" w:history="1">
             <w:r>
               <w:rPr>
                 <w:rStyle w:val="Hyperlink"/>
@@ -1465,7 +1481,7 @@
               <w:rPr>
                 <w:noProof/>
               </w:rPr>
-              <w:instrText xml:space="preserve"> PAGEREF _Toc243400849 \h </w:instrText>
+              <w:instrText xml:space="preserve"> PAGEREF _Toc243510132 \h </w:instrText>
             </w:r>
             <w:r>
               <w:rPr>
@@ -1507,7 +1523,7 @@
               <w14:ligatures w14:val="standardContextual"/>
             </w:rPr>
           </w:pPr>
-          <w:hyperlink w:anchor="_Toc243400850" w:history="1">
+          <w:hyperlink w:anchor="_Toc243510133" w:history="1">
             <w:r>
               <w:rPr>
                 <w:rStyle w:val="Hyperlink"/>
@@ -1531,7 +1547,7 @@
               <w:rPr>
                 <w:noProof/>
               </w:rPr>
-              <w:instrText xml:space="preserve"> PAGEREF _Toc243400850 \h </w:instrText>
+              <w:instrText xml:space="preserve"> PAGEREF _Toc243510133 \h </w:instrText>
             </w:r>
             <w:r>
               <w:rPr>
@@ -1573,7 +1589,7 @@
               <w14:ligatures w14:val="standardContextual"/>
             </w:rPr>
           </w:pPr>
-          <w:hyperlink w:anchor="_Toc243400851" w:history="1">
+          <w:hyperlink w:anchor="_Toc243510134" w:history="1">
             <w:r>
               <w:rPr>
                 <w:rStyle w:val="Hyperlink"/>
@@ -1597,7 +1613,7 @@
               <w:rPr>
                 <w:noProof/>
               </w:rPr>
-              <w:instrText xml:space="preserve"> PAGEREF _Toc243400851 \h </w:instrText>
+              <w:instrText xml:space="preserve"> PAGEREF _Toc243510134 \h </w:instrText>
             </w:r>
             <w:r>
               <w:rPr>
@@ -1639,7 +1655,7 @@
               <w14:ligatures w14:val="standardContextual"/>
             </w:rPr>
           </w:pPr>
-          <w:hyperlink w:anchor="_Toc243400852" w:history="1">
+          <w:hyperlink w:anchor="_Toc243510135" w:history="1">
             <w:r>
               <w:rPr>
                 <w:rStyle w:val="Hyperlink"/>
@@ -1663,7 +1679,7 @@
               <w:rPr>
                 <w:noProof/>
               </w:rPr>
-              <w:instrText xml:space="preserve"> PAGEREF _Toc243400852 \h </w:instrText>
+              <w:instrText xml:space="preserve"> PAGEREF _Toc243510135 \h </w:instrText>
             </w:r>
             <w:r>
               <w:rPr>
@@ -1705,7 +1721,7 @@
               <w14:ligatures w14:val="standardContextual"/>
             </w:rPr>
           </w:pPr>
-          <w:hyperlink w:anchor="_Toc243400853" w:history="1">
+          <w:hyperlink w:anchor="_Toc243510136" w:history="1">
             <w:r>
               <w:rPr>
                 <w:rStyle w:val="Hyperlink"/>
@@ -1729,7 +1745,7 @@
               <w:rPr>
                 <w:noProof/>
               </w:rPr>
-              <w:instrText xml:space="preserve"> PAGEREF _Toc243400853 \h </w:instrText>
+              <w:instrText xml:space="preserve"> PAGEREF _Toc243510136 \h </w:instrText>
             </w:r>
             <w:r>
               <w:rPr>
@@ -1771,7 +1787,7 @@
               <w14:ligatures w14:val="standardContextual"/>
             </w:rPr>
           </w:pPr>
-          <w:hyperlink w:anchor="_Toc243400854" w:history="1">
+          <w:hyperlink w:anchor="_Toc243510137" w:history="1">
             <w:r>
               <w:rPr>
                 <w:rStyle w:val="Hyperlink"/>
@@ -1795,7 +1811,7 @@
               <w:rPr>
                 <w:noProof/>
               </w:rPr>
-              <w:instrText xml:space="preserve"> PAGEREF _Toc243400854 \h </w:instrText>
+              <w:instrText xml:space="preserve"> PAGEREF _Toc243510137 \h </w:instrText>
             </w:r>
             <w:r>
               <w:rPr>
@@ -1837,7 +1853,7 @@
               <w14:ligatures w14:val="standardContextual"/>
             </w:rPr>
           </w:pPr>
-          <w:hyperlink w:anchor="_Toc243400855" w:history="1">
+          <w:hyperlink w:anchor="_Toc243510138" w:history="1">
             <w:r>
               <w:rPr>
                 <w:rStyle w:val="Hyperlink"/>
@@ -1861,7 +1877,7 @@
               <w:rPr>
                 <w:noProof/>
               </w:rPr>
-              <w:instrText xml:space="preserve"> PAGEREF _Toc243400855 \h </w:instrText>
+              <w:instrText xml:space="preserve"> PAGEREF _Toc243510138 \h </w:instrText>
             </w:r>
             <w:r>
               <w:rPr>
@@ -1903,7 +1919,7 @@
               <w14:ligatures w14:val="standardContextual"/>
             </w:rPr>
           </w:pPr>
-          <w:hyperlink w:anchor="_Toc243400856" w:history="1">
+          <w:hyperlink w:anchor="_Toc243510139" w:history="1">
             <w:r>
               <w:rPr>
                 <w:rStyle w:val="Hyperlink"/>
@@ -1927,7 +1943,7 @@
               <w:rPr>
                 <w:noProof/>
               </w:rPr>
-              <w:instrText xml:space="preserve"> PAGEREF _Toc243400856 \h </w:instrText>
+              <w:instrText xml:space="preserve"> PAGEREF _Toc243510139 \h </w:instrText>
             </w:r>
             <w:r>
               <w:rPr>
@@ -1969,7 +1985,7 @@
               <w14:ligatures w14:val="standardContextual"/>
             </w:rPr>
           </w:pPr>
-          <w:hyperlink w:anchor="_Toc243400857" w:history="1">
+          <w:hyperlink w:anchor="_Toc243510140" w:history="1">
             <w:r>
               <w:rPr>
                 <w:rStyle w:val="Hyperlink"/>
@@ -1993,7 +2009,7 @@
               <w:rPr>
                 <w:noProof/>
               </w:rPr>
-              <w:instrText xml:space="preserve"> PAGEREF _Toc243400857 \h </w:instrText>
+              <w:instrText xml:space="preserve"> PAGEREF _Toc243510140 \h </w:instrText>
             </w:r>
             <w:r>
               <w:rPr>
@@ -2035,7 +2051,7 @@
               <w14:ligatures w14:val="standardContextual"/>
             </w:rPr>
           </w:pPr>
-          <w:hyperlink w:anchor="_Toc243400858" w:history="1">
+          <w:hyperlink w:anchor="_Toc243510141" w:history="1">
             <w:r>
               <w:rPr>
                 <w:rStyle w:val="Hyperlink"/>
@@ -2059,7 +2075,7 @@
               <w:rPr>
                 <w:noProof/>
               </w:rPr>
-              <w:instrText xml:space="preserve"> PAGEREF _Toc243400858 \h </w:instrText>
+              <w:instrText xml:space="preserve"> PAGEREF _Toc243510141 \h </w:instrText>
             </w:r>
             <w:r>
               <w:rPr>
@@ -2101,7 +2117,7 @@
               <w14:ligatures w14:val="standardContextual"/>
             </w:rPr>
           </w:pPr>
-          <w:hyperlink w:anchor="_Toc243400859" w:history="1">
+          <w:hyperlink w:anchor="_Toc243510142" w:history="1">
             <w:r>
               <w:rPr>
                 <w:rStyle w:val="Hyperlink"/>
@@ -2125,7 +2141,7 @@
               <w:rPr>
                 <w:noProof/>
               </w:rPr>
-              <w:instrText xml:space="preserve"> PAGEREF _Toc243400859 \h </w:instrText>
+              <w:instrText xml:space="preserve"> PAGEREF _Toc243510142 \h </w:instrText>
             </w:r>
             <w:r>
               <w:rPr>
@@ -2167,7 +2183,7 @@
               <w14:ligatures w14:val="standardContextual"/>
             </w:rPr>
           </w:pPr>
-          <w:hyperlink w:anchor="_Toc243400860" w:history="1">
+          <w:hyperlink w:anchor="_Toc243510143" w:history="1">
             <w:r>
               <w:rPr>
                 <w:rStyle w:val="Hyperlink"/>
@@ -2191,7 +2207,7 @@
               <w:rPr>
                 <w:noProof/>
               </w:rPr>
-              <w:instrText xml:space="preserve"> PAGEREF _Toc243400860 \h </w:instrText>
+              <w:instrText xml:space="preserve"> PAGEREF _Toc243510143 \h </w:instrText>
             </w:r>
             <w:r>
               <w:rPr>
@@ -2233,7 +2249,7 @@
               <w14:ligatures w14:val="standardContextual"/>
             </w:rPr>
           </w:pPr>
-          <w:hyperlink w:anchor="_Toc243400861" w:history="1">
+          <w:hyperlink w:anchor="_Toc243510144" w:history="1">
             <w:r>
               <w:rPr>
                 <w:rStyle w:val="Hyperlink"/>
@@ -2257,7 +2273,7 @@
               <w:rPr>
                 <w:noProof/>
               </w:rPr>
-              <w:instrText xml:space="preserve"> PAGEREF _Toc243400861 \h </w:instrText>
+              <w:instrText xml:space="preserve"> PAGEREF _Toc243510144 \h </w:instrText>
             </w:r>
             <w:r>
               <w:rPr>
@@ -2299,7 +2315,7 @@
               <w14:ligatures w14:val="standardContextual"/>
             </w:rPr>
           </w:pPr>
-          <w:hyperlink w:anchor="_Toc243400862" w:history="1">
+          <w:hyperlink w:anchor="_Toc243510145" w:history="1">
             <w:r>
               <w:rPr>
                 <w:rStyle w:val="Hyperlink"/>
@@ -2323,7 +2339,7 @@
               <w:rPr>
                 <w:noProof/>
               </w:rPr>
-              <w:instrText xml:space="preserve"> PAGEREF _Toc243400862 \h </w:instrText>
+              <w:instrText xml:space="preserve"> PAGEREF _Toc243510145 \h </w:instrText>
             </w:r>
             <w:r>
               <w:rPr>
@@ -2365,7 +2381,7 @@
               <w14:ligatures w14:val="standardContextual"/>
             </w:rPr>
           </w:pPr>
-          <w:hyperlink w:anchor="_Toc243400863" w:history="1">
+          <w:hyperlink w:anchor="_Toc243510146" w:history="1">
             <w:r>
               <w:rPr>
                 <w:rStyle w:val="Hyperlink"/>
@@ -2389,7 +2405,7 @@
               <w:rPr>
                 <w:noProof/>
               </w:rPr>
-              <w:instrText xml:space="preserve"> PAGEREF _Toc243400863 \h </w:instrText>
+              <w:instrText xml:space="preserve"> PAGEREF _Toc243510146 \h </w:instrText>
             </w:r>
             <w:r>
               <w:rPr>
@@ -2431,7 +2447,7 @@
               <w14:ligatures w14:val="standardContextual"/>
             </w:rPr>
           </w:pPr>
-          <w:hyperlink w:anchor="_Toc243400864" w:history="1">
+          <w:hyperlink w:anchor="_Toc243510147" w:history="1">
             <w:r>
               <w:rPr>
                 <w:rStyle w:val="Hyperlink"/>
@@ -2455,7 +2471,7 @@
               <w:rPr>
                 <w:noProof/>
               </w:rPr>
-              <w:instrText xml:space="preserve"> PAGEREF _Toc243400864 \h </w:instrText>
+              <w:instrText xml:space="preserve"> PAGEREF _Toc243510147 \h </w:instrText>
             </w:r>
             <w:r>
               <w:rPr>
@@ -2497,7 +2513,7 @@
               <w14:ligatures w14:val="standardContextual"/>
             </w:rPr>
           </w:pPr>
-          <w:hyperlink w:anchor="_Toc243400865" w:history="1">
+          <w:hyperlink w:anchor="_Toc243510148" w:history="1">
             <w:r>
               <w:rPr>
                 <w:rStyle w:val="Hyperlink"/>
@@ -2521,7 +2537,7 @@
               <w:rPr>
                 <w:noProof/>
               </w:rPr>
-              <w:instrText xml:space="preserve"> PAGEREF _Toc243400865 \h </w:instrText>
+              <w:instrText xml:space="preserve"> PAGEREF _Toc243510148 \h </w:instrText>
             </w:r>
             <w:r>
               <w:rPr>
@@ -2563,7 +2579,7 @@
               <w14:ligatures w14:val="standardContextual"/>
             </w:rPr>
           </w:pPr>
-          <w:hyperlink w:anchor="_Toc243400866" w:history="1">
+          <w:hyperlink w:anchor="_Toc243510149" w:history="1">
             <w:r>
               <w:rPr>
                 <w:rStyle w:val="Hyperlink"/>
@@ -2587,7 +2603,7 @@
               <w:rPr>
                 <w:noProof/>
               </w:rPr>
-              <w:instrText xml:space="preserve"> PAGEREF _Toc243400866 \h </w:instrText>
+              <w:instrText xml:space="preserve"> PAGEREF _Toc243510149 \h </w:instrText>
             </w:r>
             <w:r>
               <w:rPr>
@@ -2629,7 +2645,7 @@
               <w14:ligatures w14:val="standardContextual"/>
             </w:rPr>
           </w:pPr>
-          <w:hyperlink w:anchor="_Toc243400867" w:history="1">
+          <w:hyperlink w:anchor="_Toc243510150" w:history="1">
             <w:r>
               <w:rPr>
                 <w:rStyle w:val="Hyperlink"/>
@@ -2653,7 +2669,7 @@
               <w:rPr>
                 <w:noProof/>
               </w:rPr>
-              <w:instrText xml:space="preserve"> PAGEREF _Toc243400867 \h </w:instrText>
+              <w:instrText xml:space="preserve"> PAGEREF _Toc243510150 \h </w:instrText>
             </w:r>
             <w:r>
               <w:rPr>
@@ -2695,7 +2711,7 @@
               <w14:ligatures w14:val="standardContextual"/>
             </w:rPr>
           </w:pPr>
-          <w:hyperlink w:anchor="_Toc243400868" w:history="1">
+          <w:hyperlink w:anchor="_Toc243510151" w:history="1">
             <w:r>
               <w:rPr>
                 <w:rStyle w:val="Hyperlink"/>
@@ -2719,7 +2735,7 @@
               <w:rPr>
                 <w:noProof/>
               </w:rPr>
-              <w:instrText xml:space="preserve"> PAGEREF _Toc243400868 \h </w:instrText>
+              <w:instrText xml:space="preserve"> PAGEREF _Toc243510151 \h </w:instrText>
             </w:r>
             <w:r>
               <w:rPr>
@@ -2761,7 +2777,7 @@
               <w14:ligatures w14:val="standardContextual"/>
             </w:rPr>
           </w:pPr>
-          <w:hyperlink w:anchor="_Toc243400869" w:history="1">
+          <w:hyperlink w:anchor="_Toc243510152" w:history="1">
             <w:r>
               <w:rPr>
                 <w:rStyle w:val="Hyperlink"/>
@@ -2785,7 +2801,7 @@
               <w:rPr>
                 <w:noProof/>
               </w:rPr>
-              <w:instrText xml:space="preserve"> PAGEREF _Toc243400869 \h </w:instrText>
+              <w:instrText xml:space="preserve"> PAGEREF _Toc243510152 \h </w:instrText>
             </w:r>
             <w:r>
               <w:rPr>
@@ -2827,7 +2843,7 @@
               <w14:ligatures w14:val="standardContextual"/>
             </w:rPr>
           </w:pPr>
-          <w:hyperlink w:anchor="_Toc243400870" w:history="1">
+          <w:hyperlink w:anchor="_Toc243510153" w:history="1">
             <w:r>
               <w:rPr>
                 <w:rStyle w:val="Hyperlink"/>
@@ -2851,7 +2867,7 @@
               <w:rPr>
                 <w:noProof/>
               </w:rPr>
-              <w:instrText xml:space="preserve"> PAGEREF _Toc243400870 \h </w:instrText>
+              <w:instrText xml:space="preserve"> PAGEREF _Toc243510153 \h </w:instrText>
             </w:r>
             <w:r>
               <w:rPr>
@@ -2893,7 +2909,7 @@
               <w14:ligatures w14:val="standardContextual"/>
             </w:rPr>
           </w:pPr>
-          <w:hyperlink w:anchor="_Toc243400871" w:history="1">
+          <w:hyperlink w:anchor="_Toc243510154" w:history="1">
             <w:r>
               <w:rPr>
                 <w:rStyle w:val="Hyperlink"/>
@@ -2917,7 +2933,7 @@
               <w:rPr>
                 <w:noProof/>
               </w:rPr>
-              <w:instrText xml:space="preserve"> PAGEREF _Toc243400871 \h </w:instrText>
+              <w:instrText xml:space="preserve"> PAGEREF _Toc243510154 \h </w:instrText>
             </w:r>
             <w:r>
               <w:rPr>
@@ -2959,7 +2975,7 @@
               <w14:ligatures w14:val="standardContextual"/>
             </w:rPr>
           </w:pPr>
-          <w:hyperlink w:anchor="_Toc243400872" w:history="1">
+          <w:hyperlink w:anchor="_Toc243510155" w:history="1">
             <w:r>
               <w:rPr>
                 <w:rStyle w:val="Hyperlink"/>
@@ -2983,7 +2999,7 @@
               <w:rPr>
                 <w:noProof/>
               </w:rPr>
-              <w:instrText xml:space="preserve"> PAGEREF _Toc243400872 \h </w:instrText>
+              <w:instrText xml:space="preserve"> PAGEREF _Toc243510155 \h </w:instrText>
             </w:r>
             <w:r>
               <w:rPr>
@@ -3051,7 +3067,7 @@
       <w:pPr>
         <w:pStyle w:val="Heading1"/>
       </w:pPr>
-      <w:bookmarkStart w:id="1" w:name="_Toc243400831"/>
+      <w:bookmarkStart w:id="1" w:name="_Toc243510114"/>
       <w:r>
         <w:t>1. Project Title and Team Details</w:t>
       </w:r>
@@ -3073,7 +3089,7 @@
           <w:left w:w="10" w:type="dxa"/>
           <w:right w:w="10" w:type="dxa"/>
         </w:tblCellMar>
-        <w:tblLook w:val="0000" w:firstRow="0" w:lastRow="0" w:firstColumn="0" w:lastColumn="0" w:noHBand="0" w:noVBand="0"/>
+        <w:tblLook w:val="04A0" w:firstRow="1" w:lastRow="0" w:firstColumn="1" w:lastColumn="0" w:noHBand="0" w:noVBand="1"/>
       </w:tblPr>
       <w:tblGrid>
         <w:gridCol w:w="2200"/>
@@ -3556,7 +3572,7 @@
                 <w:sz w:val="19"/>
                 <w:szCs w:val="19"/>
               </w:rPr>
-              <w:t>Source code</w:t>
+              <w:t>Project link</w:t>
             </w:r>
           </w:p>
         </w:tc>
@@ -3582,7 +3598,7 @@
                 <w:sz w:val="19"/>
                 <w:szCs w:val="19"/>
               </w:rPr>
-              <w:t>github.com/LordFlyaway/DBS_proj</w:t>
+              <w:t>https://dbs-proj-mauve.vercel.app</w:t>
             </w:r>
           </w:p>
         </w:tc>
@@ -3619,6 +3635,69 @@
                 <w:sz w:val="19"/>
                 <w:szCs w:val="19"/>
               </w:rPr>
+              <w:t>Source code</w:t>
+            </w:r>
+          </w:p>
+        </w:tc>
+        <w:tc>
+          <w:tcPr>
+            <w:tcW w:w="6826" w:type="dxa"/>
+            <w:tcBorders>
+              <w:top w:val="single" w:sz="6" w:space="0" w:color="000000"/>
+              <w:left w:val="single" w:sz="6" w:space="0" w:color="000000"/>
+              <w:bottom w:val="single" w:sz="6" w:space="0" w:color="000000"/>
+              <w:right w:val="single" w:sz="6" w:space="0" w:color="000000"/>
+            </w:tcBorders>
+            <w:tcMar>
+              <w:top w:w="50" w:type="dxa"/>
+              <w:left w:w="90" w:type="dxa"/>
+              <w:bottom w:w="50" w:type="dxa"/>
+              <w:right w:w="90" w:type="dxa"/>
+            </w:tcMar>
+          </w:tcPr>
+          <w:p>
+            <w:r>
+              <w:rPr>
+                <w:sz w:val="19"/>
+                <w:szCs w:val="19"/>
+              </w:rPr>
+              <w:t>github.com/LordFlyaway/DBS_proj</w:t>
+            </w:r>
+          </w:p>
+        </w:tc>
+      </w:tr>
+      <w:tr>
+        <w:tblPrEx>
+          <w:tblCellMar>
+            <w:top w:w="0" w:type="dxa"/>
+            <w:bottom w:w="0" w:type="dxa"/>
+          </w:tblCellMar>
+        </w:tblPrEx>
+        <w:trPr>
+          <w:cantSplit/>
+        </w:trPr>
+        <w:tc>
+          <w:tcPr>
+            <w:tcW w:w="2200" w:type="dxa"/>
+            <w:tcBorders>
+              <w:top w:val="single" w:sz="6" w:space="0" w:color="000000"/>
+              <w:left w:val="single" w:sz="6" w:space="0" w:color="000000"/>
+              <w:bottom w:val="single" w:sz="6" w:space="0" w:color="000000"/>
+              <w:right w:val="single" w:sz="6" w:space="0" w:color="000000"/>
+            </w:tcBorders>
+            <w:tcMar>
+              <w:top w:w="50" w:type="dxa"/>
+              <w:left w:w="90" w:type="dxa"/>
+              <w:bottom w:w="50" w:type="dxa"/>
+              <w:right w:w="90" w:type="dxa"/>
+            </w:tcMar>
+          </w:tcPr>
+          <w:p>
+            <w:r>
+              <w:rPr>
+                <w:sz w:val="19"/>
+                <w:szCs w:val="19"/>
+              </w:rPr>
               <w:t>Sample company</w:t>
             </w:r>
           </w:p>
@@ -3660,7 +3739,7 @@
       <w:pPr>
         <w:pStyle w:val="Heading1"/>
       </w:pPr>
-      <w:bookmarkStart w:id="2" w:name="_Toc243400832"/>
+      <w:bookmarkStart w:id="2" w:name="_Toc243510115"/>
       <w:r>
         <w:t>2. Introduction and Problem Statement</w:t>
       </w:r>
@@ -3670,7 +3749,7 @@
       <w:pPr>
         <w:pStyle w:val="Heading2"/>
       </w:pPr>
-      <w:bookmarkStart w:id="3" w:name="_Toc243400833"/>
+      <w:bookmarkStart w:id="3" w:name="_Toc243510116"/>
       <w:r>
         <w:t>2.1 Introduction</w:t>
       </w:r>
@@ -3696,7 +3775,7 @@
       <w:pPr>
         <w:pStyle w:val="Heading2"/>
       </w:pPr>
-      <w:bookmarkStart w:id="4" w:name="_Toc243400834"/>
+      <w:bookmarkStart w:id="4" w:name="_Toc243510117"/>
       <w:r>
         <w:t>2.2 Problem Statement</w:t>
       </w:r>
@@ -3714,7 +3793,7 @@
       <w:pPr>
         <w:pStyle w:val="Heading2"/>
       </w:pPr>
-      <w:bookmarkStart w:id="5" w:name="_Toc243400835"/>
+      <w:bookmarkStart w:id="5" w:name="_Toc243510118"/>
       <w:r>
         <w:t>2.3 Objectives</w:t>
       </w:r>
@@ -3802,7 +3881,7 @@
       <w:pPr>
         <w:pStyle w:val="Heading2"/>
       </w:pPr>
-      <w:bookmarkStart w:id="6" w:name="_Toc243400836"/>
+      <w:bookmarkStart w:id="6" w:name="_Toc243510119"/>
       <w:r>
         <w:t>2.4 Users and Roles</w:t>
       </w:r>
@@ -3824,7 +3903,7 @@
           <w:left w:w="10" w:type="dxa"/>
           <w:right w:w="10" w:type="dxa"/>
         </w:tblCellMar>
-        <w:tblLook w:val="0000" w:firstRow="0" w:lastRow="0" w:firstColumn="0" w:lastColumn="0" w:noHBand="0" w:noVBand="0"/>
+        <w:tblLook w:val="04A0" w:firstRow="1" w:lastRow="0" w:firstColumn="1" w:lastColumn="0" w:noHBand="0" w:noVBand="1"/>
       </w:tblPr>
       <w:tblGrid>
         <w:gridCol w:w="3300"/>
@@ -4189,7 +4268,7 @@
       <w:pPr>
         <w:pStyle w:val="Heading1"/>
       </w:pPr>
-      <w:bookmarkStart w:id="7" w:name="_Toc243400837"/>
+      <w:bookmarkStart w:id="7" w:name="_Toc243510120"/>
       <w:r>
         <w:t>3. Functional Requirements</w:t>
       </w:r>
@@ -4211,7 +4290,7 @@
           <w:left w:w="10" w:type="dxa"/>
           <w:right w:w="10" w:type="dxa"/>
         </w:tblCellMar>
-        <w:tblLook w:val="0000" w:firstRow="0" w:lastRow="0" w:firstColumn="0" w:lastColumn="0" w:noHBand="0" w:noVBand="0"/>
+        <w:tblLook w:val="04A0" w:firstRow="1" w:lastRow="0" w:firstColumn="1" w:lastColumn="0" w:noHBand="0" w:noVBand="1"/>
       </w:tblPr>
       <w:tblGrid>
         <w:gridCol w:w="800"/>
@@ -5491,7 +5570,7 @@
       <w:pPr>
         <w:pStyle w:val="Heading1"/>
       </w:pPr>
-      <w:bookmarkStart w:id="8" w:name="_Toc243400838"/>
+      <w:bookmarkStart w:id="8" w:name="_Toc243510121"/>
       <w:r>
         <w:t>4. ER Diagram</w:t>
       </w:r>
@@ -5507,7 +5586,7 @@
           <w:noProof/>
         </w:rPr>
         <w:drawing>
-          <wp:inline distT="0" distB="0" distL="0" distR="0" wp14:anchorId="357C6AC2" wp14:editId="01186B9F">
+          <wp:inline distT="0" distB="0" distL="0" distR="0" wp14:anchorId="43469845" wp14:editId="064C6A68">
             <wp:extent cx="8572500" cy="4914900"/>
             <wp:effectExtent l="0" t="0" r="0" b="0"/>
             <wp:docPr id="1" name="Picture 1"/>
@@ -5577,7 +5656,7 @@
       <w:pPr>
         <w:pStyle w:val="Heading1"/>
       </w:pPr>
-      <w:bookmarkStart w:id="9" w:name="_Toc243400839"/>
+      <w:bookmarkStart w:id="9" w:name="_Toc243510122"/>
       <w:r>
         <w:t>5. Relational Schema</w:t>
       </w:r>
@@ -5593,10 +5672,10 @@
           <w:noProof/>
         </w:rPr>
         <w:drawing>
-          <wp:inline distT="0" distB="0" distL="0" distR="0" wp14:anchorId="20E56FC1" wp14:editId="1CFD1369">
+          <wp:inline distT="0" distB="0" distL="0" distR="0" wp14:anchorId="3C9ADB5E" wp14:editId="1BDE78D9">
             <wp:extent cx="8191500" cy="5172075"/>
             <wp:effectExtent l="0" t="0" r="0" b="0"/>
-            <wp:docPr id="327885313" name="Picture 327885313"/>
+            <wp:docPr id="1145601972" name="Picture 1145601972"/>
             <wp:cNvGraphicFramePr>
               <a:graphicFrameLocks xmlns:a="http://schemas.openxmlformats.org/drawingml/2006/main" noChangeAspect="1"/>
             </wp:cNvGraphicFramePr>
@@ -5663,7 +5742,7 @@
       <w:pPr>
         <w:pStyle w:val="Heading2"/>
       </w:pPr>
-      <w:bookmarkStart w:id="10" w:name="_Toc243400840"/>
+      <w:bookmarkStart w:id="10" w:name="_Toc243510123"/>
       <w:r>
         <w:t>5.1 Relational Schema (text notation)</w:t>
       </w:r>
@@ -6055,7 +6134,7 @@
       <w:pPr>
         <w:pStyle w:val="Heading1"/>
       </w:pPr>
-      <w:bookmarkStart w:id="11" w:name="_Toc243400841"/>
+      <w:bookmarkStart w:id="11" w:name="_Toc243510124"/>
       <w:r>
         <w:t>6. Table Creation and Constraints</w:t>
       </w:r>
@@ -6084,7 +6163,7 @@
       <w:pPr>
         <w:pStyle w:val="Heading2"/>
       </w:pPr>
-      <w:bookmarkStart w:id="12" w:name="_Toc243400842"/>
+      <w:bookmarkStart w:id="12" w:name="_Toc243510125"/>
       <w:r>
         <w:t>6.1 Constraint Summary</w:t>
       </w:r>
@@ -6106,7 +6185,7 @@
           <w:left w:w="10" w:type="dxa"/>
           <w:right w:w="10" w:type="dxa"/>
         </w:tblCellMar>
-        <w:tblLook w:val="0000" w:firstRow="0" w:lastRow="0" w:firstColumn="0" w:lastColumn="0" w:noHBand="0" w:noVBand="0"/>
+        <w:tblLook w:val="04A0" w:firstRow="1" w:lastRow="0" w:firstColumn="1" w:lastColumn="0" w:noHBand="0" w:noVBand="1"/>
       </w:tblPr>
       <w:tblGrid>
         <w:gridCol w:w="1800"/>
@@ -6944,7 +7023,7 @@
       <w:pPr>
         <w:pStyle w:val="Heading2"/>
       </w:pPr>
-      <w:bookmarkStart w:id="13" w:name="_Toc243400843"/>
+      <w:bookmarkStart w:id="13" w:name="_Toc243510126"/>
       <w:r>
         <w:t>6.2 Data Population</w:t>
       </w:r>
@@ -6974,7 +7053,7 @@
           <w:left w:w="10" w:type="dxa"/>
           <w:right w:w="10" w:type="dxa"/>
         </w:tblCellMar>
-        <w:tblLook w:val="0000" w:firstRow="0" w:lastRow="0" w:firstColumn="0" w:lastColumn="0" w:noHBand="0" w:noVBand="0"/>
+        <w:tblLook w:val="04A0" w:firstRow="1" w:lastRow="0" w:firstColumn="1" w:lastColumn="0" w:noHBand="0" w:noVBand="1"/>
       </w:tblPr>
       <w:tblGrid>
         <w:gridCol w:w="4500"/>
@@ -7556,7 +7635,7 @@
       <w:pPr>
         <w:pStyle w:val="Heading2"/>
       </w:pPr>
-      <w:bookmarkStart w:id="14" w:name="_Toc243400844"/>
+      <w:bookmarkStart w:id="14" w:name="_Toc243510127"/>
       <w:r>
         <w:t>6.3 DML Demonstration</w:t>
       </w:r>
@@ -7586,7 +7665,7 @@
           <w:left w:w="10" w:type="dxa"/>
           <w:right w:w="10" w:type="dxa"/>
         </w:tblCellMar>
-        <w:tblLook w:val="0000" w:firstRow="0" w:lastRow="0" w:firstColumn="0" w:lastColumn="0" w:noHBand="0" w:noVBand="0"/>
+        <w:tblLook w:val="04A0" w:firstRow="1" w:lastRow="0" w:firstColumn="1" w:lastColumn="0" w:noHBand="0" w:noVBand="1"/>
       </w:tblPr>
       <w:tblGrid>
         <w:gridCol w:w="450"/>
@@ -8499,7 +8578,7 @@
       <w:pPr>
         <w:pStyle w:val="Heading1"/>
       </w:pPr>
-      <w:bookmarkStart w:id="15" w:name="_Toc243400845"/>
+      <w:bookmarkStart w:id="15" w:name="_Toc243510128"/>
       <w:r>
         <w:t>7. SQL Queries and Outputs</w:t>
       </w:r>
@@ -8540,7 +8619,7 @@
           <w:left w:w="10" w:type="dxa"/>
           <w:right w:w="10" w:type="dxa"/>
         </w:tblCellMar>
-        <w:tblLook w:val="0000" w:firstRow="0" w:lastRow="0" w:firstColumn="0" w:lastColumn="0" w:noHBand="0" w:noVBand="0"/>
+        <w:tblLook w:val="04A0" w:firstRow="1" w:lastRow="0" w:firstColumn="1" w:lastColumn="0" w:noHBand="0" w:noVBand="1"/>
       </w:tblPr>
       <w:tblGrid>
         <w:gridCol w:w="600"/>
@@ -10861,7 +10940,7 @@
       <w:pPr>
         <w:pStyle w:val="Heading2"/>
       </w:pPr>
-      <w:bookmarkStart w:id="16" w:name="_Toc243400846"/>
+      <w:bookmarkStart w:id="16" w:name="_Toc243510129"/>
       <w:r>
         <w:t>Q4. Department-wise salary cost for the latest payroll month</w:t>
       </w:r>
@@ -10883,7 +10962,7 @@
           <w:left w:w="10" w:type="dxa"/>
           <w:right w:w="10" w:type="dxa"/>
         </w:tblCellMar>
-        <w:tblLook w:val="0000" w:firstRow="0" w:lastRow="0" w:firstColumn="0" w:lastColumn="0" w:noHBand="0" w:noVBand="0"/>
+        <w:tblLook w:val="04A0" w:firstRow="1" w:lastRow="0" w:firstColumn="1" w:lastColumn="0" w:noHBand="0" w:noVBand="1"/>
       </w:tblPr>
       <w:tblGrid>
         <w:gridCol w:w="9026"/>
@@ -11114,7 +11193,7 @@
           <w:left w:w="10" w:type="dxa"/>
           <w:right w:w="10" w:type="dxa"/>
         </w:tblCellMar>
-        <w:tblLook w:val="0000" w:firstRow="0" w:lastRow="0" w:firstColumn="0" w:lastColumn="0" w:noHBand="0" w:noVBand="0"/>
+        <w:tblLook w:val="04A0" w:firstRow="1" w:lastRow="0" w:firstColumn="1" w:lastColumn="0" w:noHBand="0" w:noVBand="1"/>
       </w:tblPr>
       <w:tblGrid>
         <w:gridCol w:w="2098"/>
@@ -12689,7 +12768,7 @@
       <w:pPr>
         <w:pStyle w:val="Heading2"/>
       </w:pPr>
-      <w:bookmarkStart w:id="17" w:name="_Toc243400847"/>
+      <w:bookmarkStart w:id="17" w:name="_Toc243510130"/>
       <w:r>
         <w:t>Q5. Top 5 earners by net salary in the latest month (with rank)</w:t>
       </w:r>
@@ -12711,7 +12790,7 @@
           <w:left w:w="10" w:type="dxa"/>
           <w:right w:w="10" w:type="dxa"/>
         </w:tblCellMar>
-        <w:tblLook w:val="0000" w:firstRow="0" w:lastRow="0" w:firstColumn="0" w:lastColumn="0" w:noHBand="0" w:noVBand="0"/>
+        <w:tblLook w:val="04A0" w:firstRow="1" w:lastRow="0" w:firstColumn="1" w:lastColumn="0" w:noHBand="0" w:noVBand="1"/>
       </w:tblPr>
       <w:tblGrid>
         <w:gridCol w:w="9026"/>
@@ -12932,7 +13011,7 @@
           <w:left w:w="10" w:type="dxa"/>
           <w:right w:w="10" w:type="dxa"/>
         </w:tblCellMar>
-        <w:tblLook w:val="0000" w:firstRow="0" w:lastRow="0" w:firstColumn="0" w:lastColumn="0" w:noHBand="0" w:noVBand="0"/>
+        <w:tblLook w:val="04A0" w:firstRow="1" w:lastRow="0" w:firstColumn="1" w:lastColumn="0" w:noHBand="0" w:noVBand="1"/>
       </w:tblPr>
       <w:tblGrid>
         <w:gridCol w:w="1032"/>
@@ -13643,7 +13722,7 @@
       <w:pPr>
         <w:pStyle w:val="Heading2"/>
       </w:pPr>
-      <w:bookmarkStart w:id="18" w:name="_Toc243400848"/>
+      <w:bookmarkStart w:id="18" w:name="_Toc243510131"/>
       <w:r>
         <w:t>Q8. Remaining 2026 leave balance of every active employee</w:t>
       </w:r>
@@ -13665,7 +13744,7 @@
           <w:left w:w="10" w:type="dxa"/>
           <w:right w:w="10" w:type="dxa"/>
         </w:tblCellMar>
-        <w:tblLook w:val="0000" w:firstRow="0" w:lastRow="0" w:firstColumn="0" w:lastColumn="0" w:noHBand="0" w:noVBand="0"/>
+        <w:tblLook w:val="04A0" w:firstRow="1" w:lastRow="0" w:firstColumn="1" w:lastColumn="0" w:noHBand="0" w:noVBand="1"/>
       </w:tblPr>
       <w:tblGrid>
         <w:gridCol w:w="9026"/>
@@ -13806,7 +13885,7 @@
           <w:left w:w="10" w:type="dxa"/>
           <w:right w:w="10" w:type="dxa"/>
         </w:tblCellMar>
-        <w:tblLook w:val="0000" w:firstRow="0" w:lastRow="0" w:firstColumn="0" w:lastColumn="0" w:noHBand="0" w:noVBand="0"/>
+        <w:tblLook w:val="04A0" w:firstRow="1" w:lastRow="0" w:firstColumn="1" w:lastColumn="0" w:noHBand="0" w:noVBand="1"/>
       </w:tblPr>
       <w:tblGrid>
         <w:gridCol w:w="1751"/>
@@ -15092,7 +15171,7 @@
       <w:pPr>
         <w:pStyle w:val="Heading2"/>
       </w:pPr>
-      <w:bookmarkStart w:id="19" w:name="_Toc243400849"/>
+      <w:bookmarkStart w:id="19" w:name="_Toc243510132"/>
       <w:r>
         <w:t>Q14. Departments whose average net salary is above the company average (latest month)</w:t>
       </w:r>
@@ -15114,7 +15193,7 @@
           <w:left w:w="10" w:type="dxa"/>
           <w:right w:w="10" w:type="dxa"/>
         </w:tblCellMar>
-        <w:tblLook w:val="0000" w:firstRow="0" w:lastRow="0" w:firstColumn="0" w:lastColumn="0" w:noHBand="0" w:noVBand="0"/>
+        <w:tblLook w:val="04A0" w:firstRow="1" w:lastRow="0" w:firstColumn="1" w:lastColumn="0" w:noHBand="0" w:noVBand="1"/>
       </w:tblPr>
       <w:tblGrid>
         <w:gridCol w:w="9026"/>
@@ -15345,7 +15424,7 @@
           <w:left w:w="10" w:type="dxa"/>
           <w:right w:w="10" w:type="dxa"/>
         </w:tblCellMar>
-        <w:tblLook w:val="0000" w:firstRow="0" w:lastRow="0" w:firstColumn="0" w:lastColumn="0" w:noHBand="0" w:noVBand="0"/>
+        <w:tblLook w:val="04A0" w:firstRow="1" w:lastRow="0" w:firstColumn="1" w:lastColumn="0" w:noHBand="0" w:noVBand="1"/>
       </w:tblPr>
       <w:tblGrid>
         <w:gridCol w:w="4485"/>
@@ -15680,7 +15759,7 @@
       <w:pPr>
         <w:pStyle w:val="Heading1"/>
       </w:pPr>
-      <w:bookmarkStart w:id="20" w:name="_Toc243400850"/>
+      <w:bookmarkStart w:id="20" w:name="_Toc243510133"/>
       <w:r>
         <w:t>8. Procedures, Functions, Cursor and Triggers</w:t>
       </w:r>
@@ -15720,7 +15799,7 @@
       <w:pPr>
         <w:pStyle w:val="Heading2"/>
       </w:pPr>
-      <w:bookmarkStart w:id="21" w:name="_Toc243400851"/>
+      <w:bookmarkStart w:id="21" w:name="_Toc243510134"/>
       <w:r>
         <w:t>8.1 Overview</w:t>
       </w:r>
@@ -15742,7 +15821,7 @@
           <w:left w:w="10" w:type="dxa"/>
           <w:right w:w="10" w:type="dxa"/>
         </w:tblCellMar>
-        <w:tblLook w:val="0000" w:firstRow="0" w:lastRow="0" w:firstColumn="0" w:lastColumn="0" w:noHBand="0" w:noVBand="0"/>
+        <w:tblLook w:val="04A0" w:firstRow="1" w:lastRow="0" w:firstColumn="1" w:lastColumn="0" w:noHBand="0" w:noVBand="1"/>
       </w:tblPr>
       <w:tblGrid>
         <w:gridCol w:w="1500"/>
@@ -17173,7 +17252,7 @@
       <w:pPr>
         <w:pStyle w:val="Heading2"/>
       </w:pPr>
-      <w:bookmarkStart w:id="22" w:name="_Toc243400852"/>
+      <w:bookmarkStart w:id="22" w:name="_Toc243510135"/>
       <w:r>
         <w:t>8.2 Procedure with Cursor – generate_monthly_payroll</w:t>
       </w:r>
@@ -17195,7 +17274,7 @@
           <w:left w:w="10" w:type="dxa"/>
           <w:right w:w="10" w:type="dxa"/>
         </w:tblCellMar>
-        <w:tblLook w:val="0000" w:firstRow="0" w:lastRow="0" w:firstColumn="0" w:lastColumn="0" w:noHBand="0" w:noVBand="0"/>
+        <w:tblLook w:val="04A0" w:firstRow="1" w:lastRow="0" w:firstColumn="1" w:lastColumn="0" w:noHBand="0" w:noVBand="1"/>
       </w:tblPr>
       <w:tblGrid>
         <w:gridCol w:w="9026"/>
@@ -18105,7 +18184,7 @@
           <w:left w:w="10" w:type="dxa"/>
           <w:right w:w="10" w:type="dxa"/>
         </w:tblCellMar>
-        <w:tblLook w:val="0000" w:firstRow="0" w:lastRow="0" w:firstColumn="0" w:lastColumn="0" w:noHBand="0" w:noVBand="0"/>
+        <w:tblLook w:val="04A0" w:firstRow="1" w:lastRow="0" w:firstColumn="1" w:lastColumn="0" w:noHBand="0" w:noVBand="1"/>
       </w:tblPr>
       <w:tblGrid>
         <w:gridCol w:w="632"/>
@@ -19689,7 +19768,7 @@
       <w:pPr>
         <w:pStyle w:val="Heading2"/>
       </w:pPr>
-      <w:bookmarkStart w:id="23" w:name="_Toc243400853"/>
+      <w:bookmarkStart w:id="23" w:name="_Toc243510136"/>
       <w:r>
         <w:t>8.3 Trigger – trg_leave_approved</w:t>
       </w:r>
@@ -19711,7 +19790,7 @@
           <w:left w:w="10" w:type="dxa"/>
           <w:right w:w="10" w:type="dxa"/>
         </w:tblCellMar>
-        <w:tblLook w:val="0000" w:firstRow="0" w:lastRow="0" w:firstColumn="0" w:lastColumn="0" w:noHBand="0" w:noVBand="0"/>
+        <w:tblLook w:val="04A0" w:firstRow="1" w:lastRow="0" w:firstColumn="1" w:lastColumn="0" w:noHBand="0" w:noVBand="1"/>
       </w:tblPr>
       <w:tblGrid>
         <w:gridCol w:w="9026"/>
@@ -20046,7 +20125,7 @@
           <w:left w:w="10" w:type="dxa"/>
           <w:right w:w="10" w:type="dxa"/>
         </w:tblCellMar>
-        <w:tblLook w:val="0000" w:firstRow="0" w:lastRow="0" w:firstColumn="0" w:lastColumn="0" w:noHBand="0" w:noVBand="0"/>
+        <w:tblLook w:val="04A0" w:firstRow="1" w:lastRow="0" w:firstColumn="1" w:lastColumn="0" w:noHBand="0" w:noVBand="1"/>
       </w:tblPr>
       <w:tblGrid>
         <w:gridCol w:w="5236"/>
@@ -20250,7 +20329,7 @@
       <w:pPr>
         <w:pStyle w:val="Heading2"/>
       </w:pPr>
-      <w:bookmarkStart w:id="24" w:name="_Toc243400854"/>
+      <w:bookmarkStart w:id="24" w:name="_Toc243510137"/>
       <w:r>
         <w:t>8.4 Calling Procedures from the Application</w:t>
       </w:r>
@@ -20301,7 +20380,7 @@
           <w:left w:w="10" w:type="dxa"/>
           <w:right w:w="10" w:type="dxa"/>
         </w:tblCellMar>
-        <w:tblLook w:val="0000" w:firstRow="0" w:lastRow="0" w:firstColumn="0" w:lastColumn="0" w:noHBand="0" w:noVBand="0"/>
+        <w:tblLook w:val="04A0" w:firstRow="1" w:lastRow="0" w:firstColumn="1" w:lastColumn="0" w:noHBand="0" w:noVBand="1"/>
       </w:tblPr>
       <w:tblGrid>
         <w:gridCol w:w="9026"/>
@@ -20511,7 +20590,7 @@
       <w:pPr>
         <w:pStyle w:val="Heading1"/>
       </w:pPr>
-      <w:bookmarkStart w:id="25" w:name="_Toc243400855"/>
+      <w:bookmarkStart w:id="25" w:name="_Toc243510138"/>
       <w:r>
         <w:t>9. Real-World Transaction Demonstrations</w:t>
       </w:r>
@@ -20521,7 +20600,7 @@
       <w:pPr>
         <w:pStyle w:val="Heading2"/>
       </w:pPr>
-      <w:bookmarkStart w:id="26" w:name="_Toc243400856"/>
+      <w:bookmarkStart w:id="26" w:name="_Toc243510139"/>
       <w:r>
         <w:t>9.1 Application and Database Connectivity</w:t>
       </w:r>
@@ -20573,7 +20652,7 @@
           <w:left w:w="10" w:type="dxa"/>
           <w:right w:w="10" w:type="dxa"/>
         </w:tblCellMar>
-        <w:tblLook w:val="0000" w:firstRow="0" w:lastRow="0" w:firstColumn="0" w:lastColumn="0" w:noHBand="0" w:noVBand="0"/>
+        <w:tblLook w:val="04A0" w:firstRow="1" w:lastRow="0" w:firstColumn="1" w:lastColumn="0" w:noHBand="0" w:noVBand="1"/>
       </w:tblPr>
       <w:tblGrid>
         <w:gridCol w:w="2400"/>
@@ -21602,7 +21681,7 @@
       <w:pPr>
         <w:pStyle w:val="Heading2"/>
       </w:pPr>
-      <w:bookmarkStart w:id="27" w:name="_Toc243400857"/>
+      <w:bookmarkStart w:id="27" w:name="_Toc243510140"/>
       <w:r>
         <w:t>9.2 Integrated Workflow – One Monthly Payroll Cycle</w:t>
       </w:r>
@@ -21632,7 +21711,7 @@
           <w:left w:w="10" w:type="dxa"/>
           <w:right w:w="10" w:type="dxa"/>
         </w:tblCellMar>
-        <w:tblLook w:val="0000" w:firstRow="0" w:lastRow="0" w:firstColumn="0" w:lastColumn="0" w:noHBand="0" w:noVBand="0"/>
+        <w:tblLook w:val="04A0" w:firstRow="1" w:lastRow="0" w:firstColumn="1" w:lastColumn="0" w:noHBand="0" w:noVBand="1"/>
       </w:tblPr>
       <w:tblGrid>
         <w:gridCol w:w="600"/>
@@ -23242,7 +23321,7 @@
           <w:left w:w="10" w:type="dxa"/>
           <w:right w:w="10" w:type="dxa"/>
         </w:tblCellMar>
-        <w:tblLook w:val="0000" w:firstRow="0" w:lastRow="0" w:firstColumn="0" w:lastColumn="0" w:noHBand="0" w:noVBand="0"/>
+        <w:tblLook w:val="04A0" w:firstRow="1" w:lastRow="0" w:firstColumn="1" w:lastColumn="0" w:noHBand="0" w:noVBand="1"/>
       </w:tblPr>
       <w:tblGrid>
         <w:gridCol w:w="3026"/>
@@ -26592,7 +26671,7 @@
       <w:pPr>
         <w:pStyle w:val="Heading2"/>
       </w:pPr>
-      <w:bookmarkStart w:id="28" w:name="_Toc243400858"/>
+      <w:bookmarkStart w:id="28" w:name="_Toc243510141"/>
       <w:r>
         <w:t>9.3 Transactions</w:t>
       </w:r>
@@ -26602,7 +26681,7 @@
       <w:pPr>
         <w:pStyle w:val="Heading2"/>
       </w:pPr>
-      <w:bookmarkStart w:id="29" w:name="_Toc243400859"/>
+      <w:bookmarkStart w:id="29" w:name="_Toc243510142"/>
       <w:r>
         <w:t>T1. Employee checks in</w:t>
       </w:r>
@@ -26624,7 +26703,7 @@
           <w:left w:w="10" w:type="dxa"/>
           <w:right w:w="10" w:type="dxa"/>
         </w:tblCellMar>
-        <w:tblLook w:val="0000" w:firstRow="0" w:lastRow="0" w:firstColumn="0" w:lastColumn="0" w:noHBand="0" w:noVBand="0"/>
+        <w:tblLook w:val="04A0" w:firstRow="1" w:lastRow="0" w:firstColumn="1" w:lastColumn="0" w:noHBand="0" w:noVBand="1"/>
       </w:tblPr>
       <w:tblGrid>
         <w:gridCol w:w="2300"/>
@@ -27017,7 +27096,7 @@
       <w:pPr>
         <w:pStyle w:val="Heading2"/>
       </w:pPr>
-      <w:bookmarkStart w:id="30" w:name="_Toc243400860"/>
+      <w:bookmarkStart w:id="30" w:name="_Toc243510143"/>
       <w:r>
         <w:t>T2. Employee applies for leave</w:t>
       </w:r>
@@ -27039,7 +27118,7 @@
           <w:left w:w="10" w:type="dxa"/>
           <w:right w:w="10" w:type="dxa"/>
         </w:tblCellMar>
-        <w:tblLook w:val="0000" w:firstRow="0" w:lastRow="0" w:firstColumn="0" w:lastColumn="0" w:noHBand="0" w:noVBand="0"/>
+        <w:tblLook w:val="04A0" w:firstRow="1" w:lastRow="0" w:firstColumn="1" w:lastColumn="0" w:noHBand="0" w:noVBand="1"/>
       </w:tblPr>
       <w:tblGrid>
         <w:gridCol w:w="2300"/>
@@ -27432,7 +27511,7 @@
       <w:pPr>
         <w:pStyle w:val="Heading2"/>
       </w:pPr>
-      <w:bookmarkStart w:id="31" w:name="_Toc243400861"/>
+      <w:bookmarkStart w:id="31" w:name="_Toc243510144"/>
       <w:r>
         <w:t>T3. Manager approves leave</w:t>
       </w:r>
@@ -27454,7 +27533,7 @@
           <w:left w:w="10" w:type="dxa"/>
           <w:right w:w="10" w:type="dxa"/>
         </w:tblCellMar>
-        <w:tblLook w:val="0000" w:firstRow="0" w:lastRow="0" w:firstColumn="0" w:lastColumn="0" w:noHBand="0" w:noVBand="0"/>
+        <w:tblLook w:val="04A0" w:firstRow="1" w:lastRow="0" w:firstColumn="1" w:lastColumn="0" w:noHBand="0" w:noVBand="1"/>
       </w:tblPr>
       <w:tblGrid>
         <w:gridCol w:w="2300"/>
@@ -27853,10 +27932,10 @@
           <w:noProof/>
         </w:rPr>
         <w:drawing>
-          <wp:inline distT="0" distB="0" distL="0" distR="0" wp14:anchorId="33DE6F63" wp14:editId="7763E8B0">
+          <wp:inline distT="0" distB="0" distL="0" distR="0" wp14:anchorId="40CECC30" wp14:editId="587C1F7C">
             <wp:extent cx="5715000" cy="3571875"/>
             <wp:effectExtent l="0" t="0" r="0" b="0"/>
-            <wp:docPr id="554919216" name="Picture 554919216"/>
+            <wp:docPr id="333972860" name="Picture 333972860"/>
             <wp:cNvGraphicFramePr>
               <a:graphicFrameLocks xmlns:a="http://schemas.openxmlformats.org/drawingml/2006/main" noChangeAspect="1"/>
             </wp:cNvGraphicFramePr>
@@ -27912,7 +27991,7 @@
       <w:pPr>
         <w:pStyle w:val="Heading2"/>
       </w:pPr>
-      <w:bookmarkStart w:id="32" w:name="_Toc243400862"/>
+      <w:bookmarkStart w:id="32" w:name="_Toc243510145"/>
       <w:r>
         <w:t>T4. Payroll officer generates the monthly payroll</w:t>
       </w:r>
@@ -27934,7 +28013,7 @@
           <w:left w:w="10" w:type="dxa"/>
           <w:right w:w="10" w:type="dxa"/>
         </w:tblCellMar>
-        <w:tblLook w:val="0000" w:firstRow="0" w:lastRow="0" w:firstColumn="0" w:lastColumn="0" w:noHBand="0" w:noVBand="0"/>
+        <w:tblLook w:val="04A0" w:firstRow="1" w:lastRow="0" w:firstColumn="1" w:lastColumn="0" w:noHBand="0" w:noVBand="1"/>
       </w:tblPr>
       <w:tblGrid>
         <w:gridCol w:w="2300"/>
@@ -28333,10 +28412,10 @@
           <w:noProof/>
         </w:rPr>
         <w:drawing>
-          <wp:inline distT="0" distB="0" distL="0" distR="0" wp14:anchorId="4EE2A794" wp14:editId="6843AFC1">
+          <wp:inline distT="0" distB="0" distL="0" distR="0" wp14:anchorId="2CD0ADEB" wp14:editId="5CACC9FD">
             <wp:extent cx="5715000" cy="3571875"/>
             <wp:effectExtent l="0" t="0" r="0" b="0"/>
-            <wp:docPr id="181913765" name="Picture 181913765"/>
+            <wp:docPr id="253322955" name="Picture 253322955"/>
             <wp:cNvGraphicFramePr>
               <a:graphicFrameLocks xmlns:a="http://schemas.openxmlformats.org/drawingml/2006/main" noChangeAspect="1"/>
             </wp:cNvGraphicFramePr>
@@ -28392,7 +28471,7 @@
       <w:pPr>
         <w:pStyle w:val="Heading2"/>
       </w:pPr>
-      <w:bookmarkStart w:id="33" w:name="_Toc243400863"/>
+      <w:bookmarkStart w:id="33" w:name="_Toc243510146"/>
       <w:r>
         <w:t>T5. Viewing an itemised payslip</w:t>
       </w:r>
@@ -28414,7 +28493,7 @@
           <w:left w:w="10" w:type="dxa"/>
           <w:right w:w="10" w:type="dxa"/>
         </w:tblCellMar>
-        <w:tblLook w:val="0000" w:firstRow="0" w:lastRow="0" w:firstColumn="0" w:lastColumn="0" w:noHBand="0" w:noVBand="0"/>
+        <w:tblLook w:val="04A0" w:firstRow="1" w:lastRow="0" w:firstColumn="1" w:lastColumn="0" w:noHBand="0" w:noVBand="1"/>
       </w:tblPr>
       <w:tblGrid>
         <w:gridCol w:w="2300"/>
@@ -28813,10 +28892,10 @@
           <w:noProof/>
         </w:rPr>
         <w:drawing>
-          <wp:inline distT="0" distB="0" distL="0" distR="0" wp14:anchorId="07BA7AE6" wp14:editId="18097FBB">
+          <wp:inline distT="0" distB="0" distL="0" distR="0" wp14:anchorId="6BCDE2E6" wp14:editId="54867249">
             <wp:extent cx="5715000" cy="3571875"/>
             <wp:effectExtent l="0" t="0" r="0" b="0"/>
-            <wp:docPr id="586605360" name="Picture 586605360"/>
+            <wp:docPr id="154924111" name="Picture 154924111"/>
             <wp:cNvGraphicFramePr>
               <a:graphicFrameLocks xmlns:a="http://schemas.openxmlformats.org/drawingml/2006/main" noChangeAspect="1"/>
             </wp:cNvGraphicFramePr>
@@ -28872,7 +28951,7 @@
       <w:pPr>
         <w:pStyle w:val="Heading2"/>
       </w:pPr>
-      <w:bookmarkStart w:id="34" w:name="_Toc243400864"/>
+      <w:bookmarkStart w:id="34" w:name="_Toc243510147"/>
       <w:r>
         <w:t>T6. Paying the month’s salaries</w:t>
       </w:r>
@@ -28894,7 +28973,7 @@
           <w:left w:w="10" w:type="dxa"/>
           <w:right w:w="10" w:type="dxa"/>
         </w:tblCellMar>
-        <w:tblLook w:val="0000" w:firstRow="0" w:lastRow="0" w:firstColumn="0" w:lastColumn="0" w:noHBand="0" w:noVBand="0"/>
+        <w:tblLook w:val="04A0" w:firstRow="1" w:lastRow="0" w:firstColumn="1" w:lastColumn="0" w:noHBand="0" w:noVBand="1"/>
       </w:tblPr>
       <w:tblGrid>
         <w:gridCol w:w="2300"/>
@@ -29287,7 +29366,7 @@
       <w:pPr>
         <w:pStyle w:val="Heading2"/>
       </w:pPr>
-      <w:bookmarkStart w:id="35" w:name="_Toc243400865"/>
+      <w:bookmarkStart w:id="35" w:name="_Toc243510148"/>
       <w:r>
         <w:t>T7. Attempt to delete a paid payslip</w:t>
       </w:r>
@@ -29309,7 +29388,7 @@
           <w:left w:w="10" w:type="dxa"/>
           <w:right w:w="10" w:type="dxa"/>
         </w:tblCellMar>
-        <w:tblLook w:val="0000" w:firstRow="0" w:lastRow="0" w:firstColumn="0" w:lastColumn="0" w:noHBand="0" w:noVBand="0"/>
+        <w:tblLook w:val="04A0" w:firstRow="1" w:lastRow="0" w:firstColumn="1" w:lastColumn="0" w:noHBand="0" w:noVBand="1"/>
       </w:tblPr>
       <w:tblGrid>
         <w:gridCol w:w="2300"/>
@@ -29708,10 +29787,10 @@
           <w:noProof/>
         </w:rPr>
         <w:drawing>
-          <wp:inline distT="0" distB="0" distL="0" distR="0" wp14:anchorId="3F75E8EC" wp14:editId="29758438">
+          <wp:inline distT="0" distB="0" distL="0" distR="0" wp14:anchorId="44DB478A" wp14:editId="2B545DFD">
             <wp:extent cx="5715000" cy="3571875"/>
             <wp:effectExtent l="0" t="0" r="0" b="0"/>
-            <wp:docPr id="1900310541" name="Picture 1900310541"/>
+            <wp:docPr id="1156142810" name="Picture 1156142810"/>
             <wp:cNvGraphicFramePr>
               <a:graphicFrameLocks xmlns:a="http://schemas.openxmlformats.org/drawingml/2006/main" noChangeAspect="1"/>
             </wp:cNvGraphicFramePr>
@@ -29767,7 +29846,7 @@
       <w:pPr>
         <w:pStyle w:val="Heading2"/>
       </w:pPr>
-      <w:bookmarkStart w:id="36" w:name="_Toc243400866"/>
+      <w:bookmarkStart w:id="36" w:name="_Toc243510149"/>
       <w:r>
         <w:t>T8. Employee resignation</w:t>
       </w:r>
@@ -29789,7 +29868,7 @@
           <w:left w:w="10" w:type="dxa"/>
           <w:right w:w="10" w:type="dxa"/>
         </w:tblCellMar>
-        <w:tblLook w:val="0000" w:firstRow="0" w:lastRow="0" w:firstColumn="0" w:lastColumn="0" w:noHBand="0" w:noVBand="0"/>
+        <w:tblLook w:val="04A0" w:firstRow="1" w:lastRow="0" w:firstColumn="1" w:lastColumn="0" w:noHBand="0" w:noVBand="1"/>
       </w:tblPr>
       <w:tblGrid>
         <w:gridCol w:w="2300"/>
@@ -30182,7 +30261,7 @@
       <w:pPr>
         <w:pStyle w:val="Heading2"/>
       </w:pPr>
-      <w:bookmarkStart w:id="37" w:name="_Toc243400867"/>
+      <w:bookmarkStart w:id="37" w:name="_Toc243510150"/>
       <w:r>
         <w:t>T9. Running the report queries from the application</w:t>
       </w:r>
@@ -30204,7 +30283,7 @@
           <w:left w:w="10" w:type="dxa"/>
           <w:right w:w="10" w:type="dxa"/>
         </w:tblCellMar>
-        <w:tblLook w:val="0000" w:firstRow="0" w:lastRow="0" w:firstColumn="0" w:lastColumn="0" w:noHBand="0" w:noVBand="0"/>
+        <w:tblLook w:val="04A0" w:firstRow="1" w:lastRow="0" w:firstColumn="1" w:lastColumn="0" w:noHBand="0" w:noVBand="1"/>
       </w:tblPr>
       <w:tblGrid>
         <w:gridCol w:w="2300"/>
@@ -30603,10 +30682,10 @@
           <w:noProof/>
         </w:rPr>
         <w:drawing>
-          <wp:inline distT="0" distB="0" distL="0" distR="0" wp14:anchorId="1C5E340F" wp14:editId="64FFE383">
+          <wp:inline distT="0" distB="0" distL="0" distR="0" wp14:anchorId="5EA6791E" wp14:editId="3381554E">
             <wp:extent cx="5715000" cy="3571875"/>
             <wp:effectExtent l="0" t="0" r="0" b="0"/>
-            <wp:docPr id="1286335937" name="Picture 1286335937"/>
+            <wp:docPr id="23606933" name="Picture 23606933"/>
             <wp:cNvGraphicFramePr>
               <a:graphicFrameLocks xmlns:a="http://schemas.openxmlformats.org/drawingml/2006/main" noChangeAspect="1"/>
             </wp:cNvGraphicFramePr>
@@ -30662,7 +30741,7 @@
       <w:pPr>
         <w:pStyle w:val="Heading2"/>
       </w:pPr>
-      <w:bookmarkStart w:id="38" w:name="_Toc243400868"/>
+      <w:bookmarkStart w:id="38" w:name="_Toc243510151"/>
       <w:r>
         <w:t>9.4 Reports Generated from the Database</w:t>
       </w:r>
@@ -30692,7 +30771,7 @@
           <w:left w:w="10" w:type="dxa"/>
           <w:right w:w="10" w:type="dxa"/>
         </w:tblCellMar>
-        <w:tblLook w:val="0000" w:firstRow="0" w:lastRow="0" w:firstColumn="0" w:lastColumn="0" w:noHBand="0" w:noVBand="0"/>
+        <w:tblLook w:val="04A0" w:firstRow="1" w:lastRow="0" w:firstColumn="1" w:lastColumn="0" w:noHBand="0" w:noVBand="1"/>
       </w:tblPr>
       <w:tblGrid>
         <w:gridCol w:w="2600"/>
@@ -31353,7 +31432,7 @@
           <w:left w:w="10" w:type="dxa"/>
           <w:right w:w="10" w:type="dxa"/>
         </w:tblCellMar>
-        <w:tblLook w:val="0000" w:firstRow="0" w:lastRow="0" w:firstColumn="0" w:lastColumn="0" w:noHBand="0" w:noVBand="0"/>
+        <w:tblLook w:val="04A0" w:firstRow="1" w:lastRow="0" w:firstColumn="1" w:lastColumn="0" w:noHBand="0" w:noVBand="1"/>
       </w:tblPr>
       <w:tblGrid>
         <w:gridCol w:w="1274"/>
@@ -31901,7 +31980,7 @@
           <w:left w:w="10" w:type="dxa"/>
           <w:right w:w="10" w:type="dxa"/>
         </w:tblCellMar>
-        <w:tblLook w:val="0000" w:firstRow="0" w:lastRow="0" w:firstColumn="0" w:lastColumn="0" w:noHBand="0" w:noVBand="0"/>
+        <w:tblLook w:val="04A0" w:firstRow="1" w:lastRow="0" w:firstColumn="1" w:lastColumn="0" w:noHBand="0" w:noVBand="1"/>
       </w:tblPr>
       <w:tblGrid>
         <w:gridCol w:w="2098"/>
@@ -33476,7 +33555,7 @@
       <w:pPr>
         <w:pStyle w:val="Heading2"/>
       </w:pPr>
-      <w:bookmarkStart w:id="39" w:name="_Toc243400869"/>
+      <w:bookmarkStart w:id="39" w:name="_Toc243510152"/>
       <w:r>
         <w:t>9.5 Validation – Invalid Operations Rejected by the Database</w:t>
       </w:r>
@@ -33506,7 +33585,7 @@
           <w:left w:w="10" w:type="dxa"/>
           <w:right w:w="10" w:type="dxa"/>
         </w:tblCellMar>
-        <w:tblLook w:val="0000" w:firstRow="0" w:lastRow="0" w:firstColumn="0" w:lastColumn="0" w:noHBand="0" w:noVBand="0"/>
+        <w:tblLook w:val="04A0" w:firstRow="1" w:lastRow="0" w:firstColumn="1" w:lastColumn="0" w:noHBand="0" w:noVBand="1"/>
       </w:tblPr>
       <w:tblGrid>
         <w:gridCol w:w="450"/>
@@ -35791,7 +35870,7 @@
       <w:pPr>
         <w:pStyle w:val="Heading1"/>
       </w:pPr>
-      <w:bookmarkStart w:id="40" w:name="_Toc243400870"/>
+      <w:bookmarkStart w:id="40" w:name="_Toc243510153"/>
       <w:r>
         <w:t>10. Conclusion</w:t>
       </w:r>
@@ -35801,7 +35880,7 @@
       <w:pPr>
         <w:pStyle w:val="Heading2"/>
       </w:pPr>
-      <w:bookmarkStart w:id="41" w:name="_Toc243400871"/>
+      <w:bookmarkStart w:id="41" w:name="_Toc243510154"/>
       <w:r>
         <w:t>10.1 Design Decisions and Justification</w:t>
       </w:r>
@@ -35823,7 +35902,7 @@
           <w:left w:w="10" w:type="dxa"/>
           <w:right w:w="10" w:type="dxa"/>
         </w:tblCellMar>
-        <w:tblLook w:val="0000" w:firstRow="0" w:lastRow="0" w:firstColumn="0" w:lastColumn="0" w:noHBand="0" w:noVBand="0"/>
+        <w:tblLook w:val="04A0" w:firstRow="1" w:lastRow="0" w:firstColumn="1" w:lastColumn="0" w:noHBand="0" w:noVBand="1"/>
       </w:tblPr>
       <w:tblGrid>
         <w:gridCol w:w="3000"/>
@@ -36594,7 +36673,7 @@
       <w:pPr>
         <w:pStyle w:val="Heading2"/>
       </w:pPr>
-      <w:bookmarkStart w:id="42" w:name="_Toc243400872"/>
+      <w:bookmarkStart w:id="42" w:name="_Toc243510155"/>
       <w:r>
         <w:t>10.2 Conclusion and Future Work</w:t>
       </w:r>
@@ -36915,64 +36994,10 @@
 <file path=word/numbering.xml><?xml version="1.0" encoding="utf-8"?>
 <w:numbering xmlns:wpc="http://schemas.microsoft.com/office/word/2010/wordprocessingCanvas" xmlns:cx="http://schemas.microsoft.com/office/drawing/2014/chartex" xmlns:cx1="http://schemas.microsoft.com/office/drawing/2015/9/8/chartex" xmlns:cx2="http://schemas.microsoft.com/office/drawing/2015/10/21/chartex" xmlns:cx3="http://schemas.microsoft.com/office/drawing/2016/5/9/chartex" xmlns:cx4="http://schemas.microsoft.com/office/drawing/2016/5/10/chartex" xmlns:cx5="http://schemas.microsoft.com/office/drawing/2016/5/11/chartex" xmlns:cx6="http://schemas.microsoft.com/office/drawing/2016/5/12/chartex" xmlns:cx7="http://schemas.microsoft.com/office/drawing/2016/5/13/chartex" xmlns:cx8="http://schemas.microsoft.com/office/drawing/2016/5/14/chartex" xmlns:mc="http://schemas.openxmlformats.org/markup-compatibility/2006" xmlns:aink="http://schemas.microsoft.com/office/drawing/2016/ink" xmlns:am3d="http://schemas.microsoft.com/office/drawing/2017/model3d" xmlns:o="urn:schemas-microsoft-com:office:office" xmlns:oel="http://schemas.microsoft.com/office/2019/extlst" xmlns:r="http://schemas.openxmlformats.org/officeDocument/2006/relationships" xmlns:m="http://schemas.openxmlformats.org/officeDocument/2006/math" xmlns:v="urn:schemas-microsoft-com:vml" xmlns:wp14="http://schemas.microsoft.com/office/word/2010/wordprocessingDrawing" xmlns:wp="http://schemas.openxmlformats.org/drawingml/2006/wordprocessingDrawing" xmlns:w10="urn:schemas-microsoft-com:office:word" xmlns:w="http://schemas.openxmlformats.org/wordprocessingml/2006/main" xmlns:w14="http://schemas.microsoft.com/office/word/2010/wordml" xmlns:w15="http://schemas.microsoft.com/office/word/2012/wordml" xmlns:w16cex="http://schemas.microsoft.com/office/word/2018/wordml/cex" xmlns:w16cid="http://schemas.microsoft.com/office/word/2016/wordml/cid" xmlns:w16="http://schemas.microsoft.com/office/word/2018/wordml" xmlns:w16du="http://schemas.microsoft.com/office/word/2023/wordml/word16du" xmlns:w16sdtdh="http://schemas.microsoft.com/office/word/2020/wordml/sdtdatahash" xmlns:w16sdtfl="http://schemas.microsoft.com/office/word/2024/wordml/sdtformatlock" xmlns:w16se="http://schemas.microsoft.com/office/word/2015/wordml/symex" xmlns:wpg="http://schemas.microsoft.com/office/word/2010/wordprocessingGroup" xmlns:wpi="http://schemas.microsoft.com/office/word/2010/wordprocessingInk" xmlns:wne="http://schemas.microsoft.com/office/word/2006/wordml" xmlns:wps="http://schemas.microsoft.com/office/word/2010/wordprocessingShape" mc:Ignorable="w14 w15 w16se w16cid w16 w16cex w16sdtdh w16sdtfl w16du wp14">
   <w:abstractNum w:abstractNumId="0" w15:restartNumberingAfterBreak="0">
-    <w:nsid w:val="097916FC"/>
+    <w:nsid w:val="2EBF0D19"/>
     <w:multiLevelType w:val="hybridMultilevel"/>
-    <w:tmpl w:val="0EF4E38C"/>
-    <w:lvl w:ilvl="0" w:tplc="34AAD580">
-      <w:start w:val="1"/>
-      <w:numFmt w:val="bullet"/>
-      <w:lvlText w:val="•"/>
-      <w:lvlJc w:val="left"/>
-      <w:pPr>
-        <w:ind w:left="720" w:hanging="360"/>
-      </w:pPr>
-    </w:lvl>
-    <w:lvl w:ilvl="1" w:tplc="2C0E978C">
-      <w:numFmt w:val="decimal"/>
-      <w:lvlText w:val=""/>
-      <w:lvlJc w:val="left"/>
-    </w:lvl>
-    <w:lvl w:ilvl="2" w:tplc="7108AC8C">
-      <w:numFmt w:val="decimal"/>
-      <w:lvlText w:val=""/>
-      <w:lvlJc w:val="left"/>
-    </w:lvl>
-    <w:lvl w:ilvl="3" w:tplc="FE3CF57E">
-      <w:numFmt w:val="decimal"/>
-      <w:lvlText w:val=""/>
-      <w:lvlJc w:val="left"/>
-    </w:lvl>
-    <w:lvl w:ilvl="4" w:tplc="ACCC80CA">
-      <w:numFmt w:val="decimal"/>
-      <w:lvlText w:val=""/>
-      <w:lvlJc w:val="left"/>
-    </w:lvl>
-    <w:lvl w:ilvl="5" w:tplc="223A975E">
-      <w:numFmt w:val="decimal"/>
-      <w:lvlText w:val=""/>
-      <w:lvlJc w:val="left"/>
-    </w:lvl>
-    <w:lvl w:ilvl="6" w:tplc="678A898E">
-      <w:numFmt w:val="decimal"/>
-      <w:lvlText w:val=""/>
-      <w:lvlJc w:val="left"/>
-    </w:lvl>
-    <w:lvl w:ilvl="7" w:tplc="9F8A04C0">
-      <w:numFmt w:val="decimal"/>
-      <w:lvlText w:val=""/>
-      <w:lvlJc w:val="left"/>
-    </w:lvl>
-    <w:lvl w:ilvl="8" w:tplc="B72ED694">
-      <w:numFmt w:val="decimal"/>
-      <w:lvlText w:val=""/>
-      <w:lvlJc w:val="left"/>
-    </w:lvl>
-  </w:abstractNum>
-  <w:abstractNum w:abstractNumId="1" w15:restartNumberingAfterBreak="0">
-    <w:nsid w:val="6AEB18BA"/>
-    <w:multiLevelType w:val="hybridMultilevel"/>
-    <w:tmpl w:val="034008B0"/>
-    <w:lvl w:ilvl="0" w:tplc="A416482A">
+    <w:tmpl w:val="02724D64"/>
+    <w:lvl w:ilvl="0" w:tplc="87E87880">
       <w:start w:val="1"/>
       <w:numFmt w:val="bullet"/>
       <w:lvlText w:val="●"/>
@@ -36981,7 +37006,7 @@
         <w:ind w:left="720" w:hanging="360"/>
       </w:pPr>
     </w:lvl>
-    <w:lvl w:ilvl="1" w:tplc="FA9CC9BC">
+    <w:lvl w:ilvl="1" w:tplc="33303DA6">
       <w:start w:val="1"/>
       <w:numFmt w:val="bullet"/>
       <w:lvlText w:val="○"/>
@@ -36990,7 +37015,7 @@
         <w:ind w:left="1440" w:hanging="360"/>
       </w:pPr>
     </w:lvl>
-    <w:lvl w:ilvl="2" w:tplc="C3DC74AA">
+    <w:lvl w:ilvl="2" w:tplc="86AAC3FC">
       <w:start w:val="1"/>
       <w:numFmt w:val="bullet"/>
       <w:lvlText w:val="■"/>
@@ -36999,7 +37024,7 @@
         <w:ind w:left="2160" w:hanging="360"/>
       </w:pPr>
     </w:lvl>
-    <w:lvl w:ilvl="3" w:tplc="0952DCD4">
+    <w:lvl w:ilvl="3" w:tplc="14B6DCAC">
       <w:start w:val="1"/>
       <w:numFmt w:val="bullet"/>
       <w:lvlText w:val="●"/>
@@ -37008,7 +37033,7 @@
         <w:ind w:left="2880" w:hanging="360"/>
       </w:pPr>
     </w:lvl>
-    <w:lvl w:ilvl="4" w:tplc="60F86A2A">
+    <w:lvl w:ilvl="4" w:tplc="46AEEACC">
       <w:start w:val="1"/>
       <w:numFmt w:val="bullet"/>
       <w:lvlText w:val="○"/>
@@ -37017,7 +37042,7 @@
         <w:ind w:left="3600" w:hanging="360"/>
       </w:pPr>
     </w:lvl>
-    <w:lvl w:ilvl="5" w:tplc="2F18FB4C">
+    <w:lvl w:ilvl="5" w:tplc="38D6DE5E">
       <w:start w:val="1"/>
       <w:numFmt w:val="bullet"/>
       <w:lvlText w:val="■"/>
@@ -37026,7 +37051,7 @@
         <w:ind w:left="4320" w:hanging="360"/>
       </w:pPr>
     </w:lvl>
-    <w:lvl w:ilvl="6" w:tplc="2BE66C2C">
+    <w:lvl w:ilvl="6" w:tplc="779882F0">
       <w:start w:val="1"/>
       <w:numFmt w:val="bullet"/>
       <w:lvlText w:val="●"/>
@@ -37035,7 +37060,7 @@
         <w:ind w:left="5040" w:hanging="360"/>
       </w:pPr>
     </w:lvl>
-    <w:lvl w:ilvl="7" w:tplc="46EAE18C">
+    <w:lvl w:ilvl="7" w:tplc="A27E5596">
       <w:start w:val="1"/>
       <w:numFmt w:val="bullet"/>
       <w:lvlText w:val="●"/>
@@ -37044,7 +37069,7 @@
         <w:ind w:left="5760" w:hanging="360"/>
       </w:pPr>
     </w:lvl>
-    <w:lvl w:ilvl="8" w:tplc="6BAAE138">
+    <w:lvl w:ilvl="8" w:tplc="B074C4E0">
       <w:start w:val="1"/>
       <w:numFmt w:val="bullet"/>
       <w:lvlText w:val="●"/>
@@ -37054,14 +37079,68 @@
       </w:pPr>
     </w:lvl>
   </w:abstractNum>
-  <w:num w:numId="1" w16cid:durableId="766079899">
-    <w:abstractNumId w:val="1"/>
+  <w:abstractNum w:abstractNumId="1" w15:restartNumberingAfterBreak="0">
+    <w:nsid w:val="5A890ECD"/>
+    <w:multiLevelType w:val="hybridMultilevel"/>
+    <w:tmpl w:val="E76CACDA"/>
+    <w:lvl w:ilvl="0" w:tplc="97AAC944">
+      <w:start w:val="1"/>
+      <w:numFmt w:val="bullet"/>
+      <w:lvlText w:val="•"/>
+      <w:lvlJc w:val="left"/>
+      <w:pPr>
+        <w:ind w:left="720" w:hanging="360"/>
+      </w:pPr>
+    </w:lvl>
+    <w:lvl w:ilvl="1" w:tplc="E28CC318">
+      <w:numFmt w:val="decimal"/>
+      <w:lvlText w:val=""/>
+      <w:lvlJc w:val="left"/>
+    </w:lvl>
+    <w:lvl w:ilvl="2" w:tplc="197893EE">
+      <w:numFmt w:val="decimal"/>
+      <w:lvlText w:val=""/>
+      <w:lvlJc w:val="left"/>
+    </w:lvl>
+    <w:lvl w:ilvl="3" w:tplc="B8145B62">
+      <w:numFmt w:val="decimal"/>
+      <w:lvlText w:val=""/>
+      <w:lvlJc w:val="left"/>
+    </w:lvl>
+    <w:lvl w:ilvl="4" w:tplc="5A386C46">
+      <w:numFmt w:val="decimal"/>
+      <w:lvlText w:val=""/>
+      <w:lvlJc w:val="left"/>
+    </w:lvl>
+    <w:lvl w:ilvl="5" w:tplc="544ECB8C">
+      <w:numFmt w:val="decimal"/>
+      <w:lvlText w:val=""/>
+      <w:lvlJc w:val="left"/>
+    </w:lvl>
+    <w:lvl w:ilvl="6" w:tplc="67FE0AD0">
+      <w:numFmt w:val="decimal"/>
+      <w:lvlText w:val=""/>
+      <w:lvlJc w:val="left"/>
+    </w:lvl>
+    <w:lvl w:ilvl="7" w:tplc="4962B580">
+      <w:numFmt w:val="decimal"/>
+      <w:lvlText w:val=""/>
+      <w:lvlJc w:val="left"/>
+    </w:lvl>
+    <w:lvl w:ilvl="8" w:tplc="90D84FAE">
+      <w:numFmt w:val="decimal"/>
+      <w:lvlText w:val=""/>
+      <w:lvlJc w:val="left"/>
+    </w:lvl>
+  </w:abstractNum>
+  <w:num w:numId="1" w16cid:durableId="753819064">
+    <w:abstractNumId w:val="0"/>
     <w:lvlOverride w:ilvl="0">
       <w:startOverride w:val="1"/>
     </w:lvlOverride>
   </w:num>
-  <w:num w:numId="2" w16cid:durableId="2091660939">
-    <w:abstractNumId w:val="0"/>
+  <w:num w:numId="2" w16cid:durableId="633947210">
+    <w:abstractNumId w:val="1"/>
     <w:lvlOverride w:ilvl="0">
       <w:startOverride w:val="1"/>
     </w:lvlOverride>
@@ -37682,7 +37761,7 @@
     <w:autoRedefine/>
     <w:uiPriority w:val="39"/>
     <w:unhideWhenUsed/>
-    <w:rsid w:val="00264E4C"/>
+    <w:rsid w:val="00A21860"/>
     <w:pPr>
       <w:spacing w:after="100"/>
     </w:pPr>
@@ -37694,7 +37773,7 @@
     <w:autoRedefine/>
     <w:uiPriority w:val="39"/>
     <w:unhideWhenUsed/>
-    <w:rsid w:val="00264E4C"/>
+    <w:rsid w:val="00A21860"/>
     <w:pPr>
       <w:spacing w:after="100"/>
       <w:ind w:left="220"/>

</xml_diff>